<commit_message>
docs: auteur et encadrant dans les documents, section Rendu du README
</commit_message>
<xml_diff>
--- a/docs/Plan_de_tests.docx
+++ b/docs/Plan_de_tests.docx
@@ -98,7 +98,7 @@
         <w:t xml:space="preserve">Réalisé par : </w:t>
       </w:r>
       <w:r>
-        <w:t>[NOM PRÉNOM / MEMBRES]</w:t>
+        <w:t>ESSALHI Moussa</w:t>
       </w:r>
     </w:p>
     <w:p>
@@ -128,7 +128,7 @@
         <w:t xml:space="preserve">Encadrant : </w:t>
       </w:r>
       <w:r>
-        <w:t>[NOM DU PROF]</w:t>
+        <w:t>Ayoub Koddam</w:t>
       </w:r>
     </w:p>
     <w:p>

</xml_diff>

<commit_message>
docs: liens GitHub/GitLab, badge du pipeline et description de la bascule API
</commit_message>
<xml_diff>
--- a/docs/Plan_de_tests.docx
+++ b/docs/Plan_de_tests.docx
@@ -159,6 +159,21 @@
       </w:r>
       <w:r>
         <w:t>github.com/essalhi-moussa/Automatisation_des_Tests_et_Qualite_Logicielle</w:t>
+      </w:r>
+    </w:p>
+    <w:p>
+      <w:pPr>
+        <w:spacing w:after="60"/>
+        <w:jc w:val="center"/>
+      </w:pPr>
+      <w:r>
+        <w:rPr>
+          <w:b/>
+        </w:rPr>
+        <w:t xml:space="preserve">Pipeline CI/CD : </w:t>
+      </w:r>
+      <w:r>
+        <w:t>gitlab.com/essalhi-moussa-group/automatisation_des_tests_et_qualite_logicielle</w:t>
       </w:r>
     </w:p>
     <w:p>

</xml_diff>